<commit_message>
Update Mô hình SVM thú trong rừng.docx
</commit_message>
<xml_diff>
--- a/BÀI TẬP NHÓM HẰNG TUẦN/LAB5 BÀI TOÁN PHÂN LỚP (NHÓM)/Mô hình SVM thú trong rừng.docx
+++ b/BÀI TẬP NHÓM HẰNG TUẦN/LAB5 BÀI TOÁN PHÂN LỚP (NHÓM)/Mô hình SVM thú trong rừng.docx
@@ -1,6 +1,6 @@
 
 <file path=word/document.xml><?xml version="1.0" encoding="utf-8"?>
-<w:document xmlns:wpc="http://schemas.microsoft.com/office/word/2010/wordprocessingCanvas" xmlns:cx="http://schemas.microsoft.com/office/drawing/2014/chartex" xmlns:cx1="http://schemas.microsoft.com/office/drawing/2015/9/8/chartex" xmlns:cx2="http://schemas.microsoft.com/office/drawing/2015/10/21/chartex" xmlns:cx3="http://schemas.microsoft.com/office/drawing/2016/5/9/chartex" xmlns:cx4="http://schemas.microsoft.com/office/drawing/2016/5/10/chartex" xmlns:cx5="http://schemas.microsoft.com/office/drawing/2016/5/11/chartex" xmlns:cx6="http://schemas.microsoft.com/office/drawing/2016/5/12/chartex" xmlns:cx7="http://schemas.microsoft.com/office/drawing/2016/5/13/chartex" xmlns:cx8="http://schemas.microsoft.com/office/drawing/2016/5/14/chartex" xmlns:mc="http://schemas.openxmlformats.org/markup-compatibility/2006" xmlns:aink="http://schemas.microsoft.com/office/drawing/2016/ink" xmlns:am3d="http://schemas.microsoft.com/office/drawing/2017/model3d" xmlns:o="urn:schemas-microsoft-com:office:office" xmlns:oel="http://schemas.microsoft.com/office/2019/extlst" xmlns:r="http://schemas.openxmlformats.org/officeDocument/2006/relationships" xmlns:m="http://schemas.openxmlformats.org/officeDocument/2006/math" xmlns:v="urn:schemas-microsoft-com:vml" xmlns:wp14="http://schemas.microsoft.com/office/word/2010/wordprocessingDrawing" xmlns:wp="http://schemas.openxmlformats.org/drawingml/2006/wordprocessingDrawing" xmlns:w10="urn:schemas-microsoft-com:office:word" xmlns:w="http://schemas.openxmlformats.org/wordprocessingml/2006/main" xmlns:w14="http://schemas.microsoft.com/office/word/2010/wordml" xmlns:w15="http://schemas.microsoft.com/office/word/2012/wordml" xmlns:w16cex="http://schemas.microsoft.com/office/word/2018/wordml/cex" xmlns:w16cid="http://schemas.microsoft.com/office/word/2016/wordml/cid" xmlns:w16="http://schemas.microsoft.com/office/word/2018/wordml" xmlns:w16du="http://schemas.microsoft.com/office/word/2023/wordml/word16du" xmlns:w16sdtdh="http://schemas.microsoft.com/office/word/2020/wordml/sdtdatahash" xmlns:w16sdtfl="http://schemas.microsoft.com/office/word/2024/wordml/sdtformatlock" xmlns:w16se="http://schemas.microsoft.com/office/word/2015/wordml/symex" xmlns:wpg="http://schemas.microsoft.com/office/word/2010/wordprocessingGroup" xmlns:wpi="http://schemas.microsoft.com/office/word/2010/wordprocessingInk" xmlns:wne="http://schemas.microsoft.com/office/word/2006/wordml" xmlns:wps="http://schemas.microsoft.com/office/word/2010/wordprocessingShape" mc:Ignorable="w14 w15 w16se w16cid w16 w16cex w16sdtdh w16sdtfl w16du wp14">
+<w:document xmlns:wpc="http://schemas.microsoft.com/office/word/2010/wordprocessingCanvas" xmlns:cx="http://schemas.microsoft.com/office/drawing/2014/chartex" xmlns:mc="http://schemas.openxmlformats.org/markup-compatibility/2006" xmlns:o="urn:schemas-microsoft-com:office:office" xmlns:r="http://schemas.openxmlformats.org/officeDocument/2006/relationships" xmlns:m="http://schemas.openxmlformats.org/officeDocument/2006/math" xmlns:v="urn:schemas-microsoft-com:vml" xmlns:wp14="http://schemas.microsoft.com/office/word/2010/wordprocessingDrawing" xmlns:wp="http://schemas.openxmlformats.org/drawingml/2006/wordprocessingDrawing" xmlns:w10="urn:schemas-microsoft-com:office:word" xmlns:w="http://schemas.openxmlformats.org/wordprocessingml/2006/main" xmlns:w14="http://schemas.microsoft.com/office/word/2010/wordml" xmlns:w15="http://schemas.microsoft.com/office/word/2012/wordml" xmlns:w16se="http://schemas.microsoft.com/office/word/2015/wordml/symex" xmlns:wpg="http://schemas.microsoft.com/office/word/2010/wordprocessingGroup" xmlns:wpi="http://schemas.microsoft.com/office/word/2010/wordprocessingInk" xmlns:wne="http://schemas.microsoft.com/office/word/2006/wordml" xmlns:wps="http://schemas.microsoft.com/office/word/2010/wordprocessingShape" mc:Ignorable="w14 w15 w16se wp14">
   <w:body>
     <w:p>
       <w:pPr>
@@ -157,7 +157,7 @@
               <w:bottom w:val="single" w:sz="4" w:space="0" w:color="auto"/>
               <w:right w:val="single" w:sz="4" w:space="0" w:color="auto"/>
             </w:tcBorders>
-            <w:shd w:val="clear" w:color="auto" w:fill="1E4764"/>
+            <w:shd w:val="clear" w:color="auto" w:fill="auto"/>
             <w:vAlign w:val="center"/>
             <w:hideMark/>
           </w:tcPr>
@@ -165,6 +165,7 @@
             <w:pPr>
               <w:rPr>
                 <w:rFonts w:ascii="Times New Roman" w:hAnsi="Times New Roman" w:cs="Times New Roman"/>
+                <w:color w:val="000000" w:themeColor="text1"/>
                 <w:sz w:val="26"/>
                 <w:szCs w:val="26"/>
               </w:rPr>
@@ -173,7 +174,7 @@
               <w:rPr>
                 <w:rFonts w:ascii="Times New Roman" w:hAnsi="Times New Roman" w:cs="Times New Roman"/>
                 <w:b/>
-                <w:color w:val="FFFFFF"/>
+                <w:color w:val="000000" w:themeColor="text1"/>
                 <w:sz w:val="26"/>
                 <w:szCs w:val="26"/>
               </w:rPr>
@@ -190,7 +191,7 @@
               <w:bottom w:val="single" w:sz="4" w:space="0" w:color="auto"/>
               <w:right w:val="single" w:sz="4" w:space="0" w:color="auto"/>
             </w:tcBorders>
-            <w:shd w:val="clear" w:color="auto" w:fill="1E4764"/>
+            <w:shd w:val="clear" w:color="auto" w:fill="auto"/>
             <w:vAlign w:val="center"/>
             <w:hideMark/>
           </w:tcPr>
@@ -198,6 +199,7 @@
             <w:pPr>
               <w:rPr>
                 <w:rFonts w:ascii="Times New Roman" w:hAnsi="Times New Roman" w:cs="Times New Roman"/>
+                <w:color w:val="000000" w:themeColor="text1"/>
                 <w:sz w:val="26"/>
                 <w:szCs w:val="26"/>
               </w:rPr>
@@ -206,7 +208,7 @@
               <w:rPr>
                 <w:rFonts w:ascii="Times New Roman" w:hAnsi="Times New Roman" w:cs="Times New Roman"/>
                 <w:b/>
-                <w:color w:val="FFFFFF"/>
+                <w:color w:val="000000" w:themeColor="text1"/>
                 <w:sz w:val="26"/>
                 <w:szCs w:val="26"/>
               </w:rPr>
@@ -228,6 +230,7 @@
               <w:bottom w:val="single" w:sz="4" w:space="0" w:color="auto"/>
               <w:right w:val="single" w:sz="4" w:space="0" w:color="auto"/>
             </w:tcBorders>
+            <w:shd w:val="clear" w:color="auto" w:fill="auto"/>
             <w:vAlign w:val="center"/>
             <w:hideMark/>
           </w:tcPr>
@@ -259,6 +262,7 @@
               <w:bottom w:val="single" w:sz="4" w:space="0" w:color="auto"/>
               <w:right w:val="single" w:sz="4" w:space="0" w:color="auto"/>
             </w:tcBorders>
+            <w:shd w:val="clear" w:color="auto" w:fill="auto"/>
             <w:vAlign w:val="center"/>
             <w:hideMark/>
           </w:tcPr>
@@ -295,7 +299,7 @@
               <w:bottom w:val="single" w:sz="4" w:space="0" w:color="auto"/>
               <w:right w:val="single" w:sz="4" w:space="0" w:color="auto"/>
             </w:tcBorders>
-            <w:shd w:val="clear" w:color="auto" w:fill="F0F5F7"/>
+            <w:shd w:val="clear" w:color="auto" w:fill="auto"/>
             <w:vAlign w:val="center"/>
             <w:hideMark/>
           </w:tcPr>
@@ -327,7 +331,7 @@
               <w:bottom w:val="single" w:sz="4" w:space="0" w:color="auto"/>
               <w:right w:val="single" w:sz="4" w:space="0" w:color="auto"/>
             </w:tcBorders>
-            <w:shd w:val="clear" w:color="auto" w:fill="F0F5F7"/>
+            <w:shd w:val="clear" w:color="auto" w:fill="auto"/>
             <w:vAlign w:val="center"/>
             <w:hideMark/>
           </w:tcPr>
@@ -364,6 +368,7 @@
               <w:bottom w:val="single" w:sz="4" w:space="0" w:color="auto"/>
               <w:right w:val="single" w:sz="4" w:space="0" w:color="auto"/>
             </w:tcBorders>
+            <w:shd w:val="clear" w:color="auto" w:fill="auto"/>
             <w:vAlign w:val="center"/>
             <w:hideMark/>
           </w:tcPr>
@@ -395,6 +400,7 @@
               <w:bottom w:val="single" w:sz="4" w:space="0" w:color="auto"/>
               <w:right w:val="single" w:sz="4" w:space="0" w:color="auto"/>
             </w:tcBorders>
+            <w:shd w:val="clear" w:color="auto" w:fill="auto"/>
             <w:vAlign w:val="center"/>
             <w:hideMark/>
           </w:tcPr>
@@ -431,7 +437,7 @@
               <w:bottom w:val="single" w:sz="4" w:space="0" w:color="auto"/>
               <w:right w:val="single" w:sz="4" w:space="0" w:color="auto"/>
             </w:tcBorders>
-            <w:shd w:val="clear" w:color="auto" w:fill="F0F5F7"/>
+            <w:shd w:val="clear" w:color="auto" w:fill="auto"/>
             <w:vAlign w:val="center"/>
             <w:hideMark/>
           </w:tcPr>
@@ -463,7 +469,7 @@
               <w:bottom w:val="single" w:sz="4" w:space="0" w:color="auto"/>
               <w:right w:val="single" w:sz="4" w:space="0" w:color="auto"/>
             </w:tcBorders>
-            <w:shd w:val="clear" w:color="auto" w:fill="F0F5F7"/>
+            <w:shd w:val="clear" w:color="auto" w:fill="auto"/>
             <w:vAlign w:val="center"/>
             <w:hideMark/>
           </w:tcPr>
@@ -500,6 +506,7 @@
               <w:bottom w:val="single" w:sz="4" w:space="0" w:color="auto"/>
               <w:right w:val="single" w:sz="4" w:space="0" w:color="auto"/>
             </w:tcBorders>
+            <w:shd w:val="clear" w:color="auto" w:fill="auto"/>
             <w:vAlign w:val="center"/>
             <w:hideMark/>
           </w:tcPr>
@@ -531,6 +538,7 @@
               <w:bottom w:val="single" w:sz="4" w:space="0" w:color="auto"/>
               <w:right w:val="single" w:sz="4" w:space="0" w:color="auto"/>
             </w:tcBorders>
+            <w:shd w:val="clear" w:color="auto" w:fill="auto"/>
             <w:vAlign w:val="center"/>
             <w:hideMark/>
           </w:tcPr>
@@ -672,6 +680,7 @@
         </w:numPr>
         <w:rPr>
           <w:rFonts w:ascii="Times New Roman" w:hAnsi="Times New Roman" w:cs="Times New Roman"/>
+          <w:color w:val="000000" w:themeColor="text1"/>
           <w:sz w:val="26"/>
           <w:szCs w:val="26"/>
         </w:rPr>
@@ -679,6 +688,7 @@
       <w:r>
         <w:rPr>
           <w:rFonts w:ascii="Times New Roman" w:hAnsi="Times New Roman" w:cs="Times New Roman"/>
+          <w:color w:val="000000" w:themeColor="text1"/>
           <w:sz w:val="26"/>
           <w:szCs w:val="26"/>
         </w:rPr>
@@ -694,6 +704,7 @@
         </w:numPr>
         <w:rPr>
           <w:rFonts w:ascii="Times New Roman" w:hAnsi="Times New Roman" w:cs="Times New Roman"/>
+          <w:color w:val="000000" w:themeColor="text1"/>
           <w:sz w:val="26"/>
           <w:szCs w:val="26"/>
         </w:rPr>
@@ -701,6 +712,7 @@
       <w:r>
         <w:rPr>
           <w:rFonts w:ascii="Times New Roman" w:hAnsi="Times New Roman" w:cs="Times New Roman"/>
+          <w:color w:val="000000" w:themeColor="text1"/>
           <w:sz w:val="26"/>
           <w:szCs w:val="26"/>
         </w:rPr>
@@ -716,6 +728,7 @@
         </w:numPr>
         <w:rPr>
           <w:rFonts w:ascii="Times New Roman" w:hAnsi="Times New Roman" w:cs="Times New Roman"/>
+          <w:color w:val="000000" w:themeColor="text1"/>
           <w:sz w:val="26"/>
           <w:szCs w:val="26"/>
         </w:rPr>
@@ -723,6 +736,7 @@
       <w:r>
         <w:rPr>
           <w:rFonts w:ascii="Times New Roman" w:hAnsi="Times New Roman" w:cs="Times New Roman"/>
+          <w:color w:val="000000" w:themeColor="text1"/>
           <w:sz w:val="26"/>
           <w:szCs w:val="26"/>
         </w:rPr>
@@ -738,6 +752,7 @@
         </w:numPr>
         <w:rPr>
           <w:rFonts w:ascii="Times New Roman" w:hAnsi="Times New Roman" w:cs="Times New Roman"/>
+          <w:color w:val="000000" w:themeColor="text1"/>
           <w:sz w:val="26"/>
           <w:szCs w:val="26"/>
         </w:rPr>
@@ -745,6 +760,7 @@
       <w:r>
         <w:rPr>
           <w:rFonts w:ascii="Times New Roman" w:hAnsi="Times New Roman" w:cs="Times New Roman"/>
+          <w:color w:val="000000" w:themeColor="text1"/>
           <w:sz w:val="26"/>
           <w:szCs w:val="26"/>
         </w:rPr>
@@ -760,6 +776,7 @@
         </w:numPr>
         <w:rPr>
           <w:rFonts w:ascii="Times New Roman" w:hAnsi="Times New Roman" w:cs="Times New Roman"/>
+          <w:color w:val="000000" w:themeColor="text1"/>
           <w:sz w:val="26"/>
           <w:szCs w:val="26"/>
         </w:rPr>
@@ -767,26 +784,11 @@
       <w:r>
         <w:rPr>
           <w:rFonts w:ascii="Times New Roman" w:hAnsi="Times New Roman" w:cs="Times New Roman"/>
-          <w:sz w:val="26"/>
-          <w:szCs w:val="26"/>
-        </w:rPr>
-        <w:t>Huấn luyện SVC</w:t>
-      </w:r>
-      <w:r>
-        <w:rPr>
-          <w:rFonts w:ascii="Times New Roman" w:hAnsi="Times New Roman" w:cs="Times New Roman"/>
-          <w:sz w:val="26"/>
-          <w:szCs w:val="26"/>
-        </w:rPr>
-        <w:t xml:space="preserve"> </w:t>
-      </w:r>
-      <w:r>
-        <w:rPr>
-          <w:rFonts w:ascii="Times New Roman" w:hAnsi="Times New Roman" w:cs="Times New Roman"/>
-          <w:sz w:val="26"/>
-          <w:szCs w:val="26"/>
-        </w:rPr>
-        <w:t>(kernel="rbf") làm mốc ban đầu; đánh giá Accuracy, F1 Macro, Balanced Accuracy và Confusion Matrix.</w:t>
+          <w:color w:val="000000" w:themeColor="text1"/>
+          <w:sz w:val="26"/>
+          <w:szCs w:val="26"/>
+        </w:rPr>
+        <w:t>Huấn luyện SVC (kernel="rbf") làm mốc ban đầu; đánh giá Accuracy, F1 Macro, Balanced Accuracy và Confusion Matrix.</w:t>
       </w:r>
     </w:p>
     <w:p>
@@ -798,6 +800,7 @@
         </w:numPr>
         <w:rPr>
           <w:rFonts w:ascii="Times New Roman" w:hAnsi="Times New Roman" w:cs="Times New Roman"/>
+          <w:color w:val="000000" w:themeColor="text1"/>
           <w:sz w:val="26"/>
           <w:szCs w:val="26"/>
         </w:rPr>
@@ -805,6 +808,7 @@
       <w:r>
         <w:rPr>
           <w:rFonts w:ascii="Times New Roman" w:hAnsi="Times New Roman" w:cs="Times New Roman"/>
+          <w:color w:val="000000" w:themeColor="text1"/>
           <w:sz w:val="26"/>
           <w:szCs w:val="26"/>
         </w:rPr>
@@ -846,6 +850,7 @@
         </w:numPr>
         <w:rPr>
           <w:rFonts w:ascii="Times New Roman" w:hAnsi="Times New Roman" w:cs="Times New Roman"/>
+          <w:color w:val="000000" w:themeColor="text1"/>
           <w:sz w:val="26"/>
           <w:szCs w:val="26"/>
         </w:rPr>
@@ -853,6 +858,7 @@
       <w:r>
         <w:rPr>
           <w:rFonts w:ascii="Times New Roman" w:hAnsi="Times New Roman" w:cs="Times New Roman"/>
+          <w:color w:val="000000" w:themeColor="text1"/>
           <w:sz w:val="26"/>
           <w:szCs w:val="26"/>
         </w:rPr>
@@ -988,6 +994,7 @@
               <w:bottom w:val="single" w:sz="4" w:space="0" w:color="auto"/>
               <w:right w:val="single" w:sz="4" w:space="0" w:color="auto"/>
             </w:tcBorders>
+            <w:shd w:val="clear" w:color="auto" w:fill="auto"/>
             <w:vAlign w:val="center"/>
             <w:hideMark/>
           </w:tcPr>
@@ -1021,6 +1028,7 @@
               <w:bottom w:val="single" w:sz="4" w:space="0" w:color="auto"/>
               <w:right w:val="single" w:sz="4" w:space="0" w:color="auto"/>
             </w:tcBorders>
+            <w:shd w:val="clear" w:color="auto" w:fill="auto"/>
             <w:vAlign w:val="center"/>
             <w:hideMark/>
           </w:tcPr>
@@ -1058,6 +1066,7 @@
               <w:bottom w:val="single" w:sz="4" w:space="0" w:color="auto"/>
               <w:right w:val="single" w:sz="4" w:space="0" w:color="auto"/>
             </w:tcBorders>
+            <w:shd w:val="clear" w:color="auto" w:fill="auto"/>
             <w:vAlign w:val="center"/>
             <w:hideMark/>
           </w:tcPr>
@@ -1089,6 +1098,7 @@
               <w:bottom w:val="single" w:sz="4" w:space="0" w:color="auto"/>
               <w:right w:val="single" w:sz="4" w:space="0" w:color="auto"/>
             </w:tcBorders>
+            <w:shd w:val="clear" w:color="auto" w:fill="auto"/>
             <w:vAlign w:val="center"/>
             <w:hideMark/>
           </w:tcPr>
@@ -1125,7 +1135,7 @@
               <w:bottom w:val="single" w:sz="4" w:space="0" w:color="auto"/>
               <w:right w:val="single" w:sz="4" w:space="0" w:color="auto"/>
             </w:tcBorders>
-            <w:shd w:val="clear" w:color="auto" w:fill="F0F5F7"/>
+            <w:shd w:val="clear" w:color="auto" w:fill="auto"/>
             <w:vAlign w:val="center"/>
             <w:hideMark/>
           </w:tcPr>
@@ -1157,7 +1167,7 @@
               <w:bottom w:val="single" w:sz="4" w:space="0" w:color="auto"/>
               <w:right w:val="single" w:sz="4" w:space="0" w:color="auto"/>
             </w:tcBorders>
-            <w:shd w:val="clear" w:color="auto" w:fill="F0F5F7"/>
+            <w:shd w:val="clear" w:color="auto" w:fill="auto"/>
             <w:vAlign w:val="center"/>
             <w:hideMark/>
           </w:tcPr>
@@ -1194,6 +1204,7 @@
               <w:bottom w:val="single" w:sz="4" w:space="0" w:color="auto"/>
               <w:right w:val="single" w:sz="4" w:space="0" w:color="auto"/>
             </w:tcBorders>
+            <w:shd w:val="clear" w:color="auto" w:fill="auto"/>
             <w:vAlign w:val="center"/>
             <w:hideMark/>
           </w:tcPr>
@@ -1225,6 +1236,7 @@
               <w:bottom w:val="single" w:sz="4" w:space="0" w:color="auto"/>
               <w:right w:val="single" w:sz="4" w:space="0" w:color="auto"/>
             </w:tcBorders>
+            <w:shd w:val="clear" w:color="auto" w:fill="auto"/>
             <w:vAlign w:val="center"/>
             <w:hideMark/>
           </w:tcPr>
@@ -1261,7 +1273,7 @@
               <w:bottom w:val="single" w:sz="4" w:space="0" w:color="auto"/>
               <w:right w:val="single" w:sz="4" w:space="0" w:color="auto"/>
             </w:tcBorders>
-            <w:shd w:val="clear" w:color="auto" w:fill="F0F5F7"/>
+            <w:shd w:val="clear" w:color="auto" w:fill="auto"/>
             <w:vAlign w:val="center"/>
             <w:hideMark/>
           </w:tcPr>
@@ -1293,7 +1305,7 @@
               <w:bottom w:val="single" w:sz="4" w:space="0" w:color="auto"/>
               <w:right w:val="single" w:sz="4" w:space="0" w:color="auto"/>
             </w:tcBorders>
-            <w:shd w:val="clear" w:color="auto" w:fill="F0F5F7"/>
+            <w:shd w:val="clear" w:color="auto" w:fill="auto"/>
             <w:vAlign w:val="center"/>
             <w:hideMark/>
           </w:tcPr>
@@ -1354,6 +1366,7 @@
               <w:bottom w:val="single" w:sz="4" w:space="0" w:color="auto"/>
               <w:right w:val="single" w:sz="4" w:space="0" w:color="auto"/>
             </w:tcBorders>
+            <w:shd w:val="clear" w:color="auto" w:fill="auto"/>
             <w:vAlign w:val="center"/>
             <w:hideMark/>
           </w:tcPr>
@@ -1386,6 +1399,7 @@
               <w:bottom w:val="single" w:sz="4" w:space="0" w:color="auto"/>
               <w:right w:val="single" w:sz="4" w:space="0" w:color="auto"/>
             </w:tcBorders>
+            <w:shd w:val="clear" w:color="auto" w:fill="auto"/>
             <w:vAlign w:val="center"/>
             <w:hideMark/>
           </w:tcPr>
@@ -1418,6 +1432,7 @@
               <w:bottom w:val="single" w:sz="4" w:space="0" w:color="auto"/>
               <w:right w:val="single" w:sz="4" w:space="0" w:color="auto"/>
             </w:tcBorders>
+            <w:shd w:val="clear" w:color="auto" w:fill="auto"/>
             <w:vAlign w:val="center"/>
             <w:hideMark/>
           </w:tcPr>
@@ -1455,6 +1470,7 @@
               <w:bottom w:val="single" w:sz="4" w:space="0" w:color="auto"/>
               <w:right w:val="single" w:sz="4" w:space="0" w:color="auto"/>
             </w:tcBorders>
+            <w:shd w:val="clear" w:color="auto" w:fill="auto"/>
             <w:vAlign w:val="center"/>
             <w:hideMark/>
           </w:tcPr>
@@ -1486,6 +1502,7 @@
               <w:bottom w:val="single" w:sz="4" w:space="0" w:color="auto"/>
               <w:right w:val="single" w:sz="4" w:space="0" w:color="auto"/>
             </w:tcBorders>
+            <w:shd w:val="clear" w:color="auto" w:fill="auto"/>
             <w:vAlign w:val="center"/>
             <w:hideMark/>
           </w:tcPr>
@@ -1517,6 +1534,7 @@
               <w:bottom w:val="single" w:sz="4" w:space="0" w:color="auto"/>
               <w:right w:val="single" w:sz="4" w:space="0" w:color="auto"/>
             </w:tcBorders>
+            <w:shd w:val="clear" w:color="auto" w:fill="auto"/>
             <w:vAlign w:val="center"/>
             <w:hideMark/>
           </w:tcPr>
@@ -1553,7 +1571,7 @@
               <w:bottom w:val="single" w:sz="4" w:space="0" w:color="auto"/>
               <w:right w:val="single" w:sz="4" w:space="0" w:color="auto"/>
             </w:tcBorders>
-            <w:shd w:val="clear" w:color="auto" w:fill="F0F5F7"/>
+            <w:shd w:val="clear" w:color="auto" w:fill="auto"/>
             <w:vAlign w:val="center"/>
             <w:hideMark/>
           </w:tcPr>
@@ -1585,7 +1603,7 @@
               <w:bottom w:val="single" w:sz="4" w:space="0" w:color="auto"/>
               <w:right w:val="single" w:sz="4" w:space="0" w:color="auto"/>
             </w:tcBorders>
-            <w:shd w:val="clear" w:color="auto" w:fill="F0F5F7"/>
+            <w:shd w:val="clear" w:color="auto" w:fill="auto"/>
             <w:vAlign w:val="center"/>
             <w:hideMark/>
           </w:tcPr>
@@ -1617,7 +1635,7 @@
               <w:bottom w:val="single" w:sz="4" w:space="0" w:color="auto"/>
               <w:right w:val="single" w:sz="4" w:space="0" w:color="auto"/>
             </w:tcBorders>
-            <w:shd w:val="clear" w:color="auto" w:fill="F0F5F7"/>
+            <w:shd w:val="clear" w:color="auto" w:fill="auto"/>
             <w:vAlign w:val="center"/>
             <w:hideMark/>
           </w:tcPr>
@@ -1654,6 +1672,7 @@
               <w:bottom w:val="single" w:sz="4" w:space="0" w:color="auto"/>
               <w:right w:val="single" w:sz="4" w:space="0" w:color="auto"/>
             </w:tcBorders>
+            <w:shd w:val="clear" w:color="auto" w:fill="auto"/>
             <w:vAlign w:val="center"/>
             <w:hideMark/>
           </w:tcPr>
@@ -1685,6 +1704,7 @@
               <w:bottom w:val="single" w:sz="4" w:space="0" w:color="auto"/>
               <w:right w:val="single" w:sz="4" w:space="0" w:color="auto"/>
             </w:tcBorders>
+            <w:shd w:val="clear" w:color="auto" w:fill="auto"/>
             <w:vAlign w:val="center"/>
             <w:hideMark/>
           </w:tcPr>
@@ -1716,6 +1736,7 @@
               <w:bottom w:val="single" w:sz="4" w:space="0" w:color="auto"/>
               <w:right w:val="single" w:sz="4" w:space="0" w:color="auto"/>
             </w:tcBorders>
+            <w:shd w:val="clear" w:color="auto" w:fill="auto"/>
             <w:vAlign w:val="center"/>
             <w:hideMark/>
           </w:tcPr>
@@ -1752,7 +1773,7 @@
               <w:bottom w:val="single" w:sz="4" w:space="0" w:color="auto"/>
               <w:right w:val="single" w:sz="4" w:space="0" w:color="auto"/>
             </w:tcBorders>
-            <w:shd w:val="clear" w:color="auto" w:fill="F0F5F7"/>
+            <w:shd w:val="clear" w:color="auto" w:fill="auto"/>
             <w:vAlign w:val="center"/>
             <w:hideMark/>
           </w:tcPr>
@@ -1784,7 +1805,7 @@
               <w:bottom w:val="single" w:sz="4" w:space="0" w:color="auto"/>
               <w:right w:val="single" w:sz="4" w:space="0" w:color="auto"/>
             </w:tcBorders>
-            <w:shd w:val="clear" w:color="auto" w:fill="F0F5F7"/>
+            <w:shd w:val="clear" w:color="auto" w:fill="auto"/>
             <w:vAlign w:val="center"/>
             <w:hideMark/>
           </w:tcPr>
@@ -1816,7 +1837,7 @@
               <w:bottom w:val="single" w:sz="4" w:space="0" w:color="auto"/>
               <w:right w:val="single" w:sz="4" w:space="0" w:color="auto"/>
             </w:tcBorders>
-            <w:shd w:val="clear" w:color="auto" w:fill="F0F5F7"/>
+            <w:shd w:val="clear" w:color="auto" w:fill="auto"/>
             <w:vAlign w:val="center"/>
             <w:hideMark/>
           </w:tcPr>
@@ -1853,6 +1874,7 @@
               <w:bottom w:val="single" w:sz="4" w:space="0" w:color="auto"/>
               <w:right w:val="single" w:sz="4" w:space="0" w:color="auto"/>
             </w:tcBorders>
+            <w:shd w:val="clear" w:color="auto" w:fill="auto"/>
             <w:vAlign w:val="center"/>
             <w:hideMark/>
           </w:tcPr>
@@ -1884,6 +1906,7 @@
               <w:bottom w:val="single" w:sz="4" w:space="0" w:color="auto"/>
               <w:right w:val="single" w:sz="4" w:space="0" w:color="auto"/>
             </w:tcBorders>
+            <w:shd w:val="clear" w:color="auto" w:fill="auto"/>
             <w:vAlign w:val="center"/>
             <w:hideMark/>
           </w:tcPr>
@@ -1915,6 +1938,7 @@
               <w:bottom w:val="single" w:sz="4" w:space="0" w:color="auto"/>
               <w:right w:val="single" w:sz="4" w:space="0" w:color="auto"/>
             </w:tcBorders>
+            <w:shd w:val="clear" w:color="auto" w:fill="auto"/>
             <w:vAlign w:val="center"/>
             <w:hideMark/>
           </w:tcPr>
@@ -2144,8 +2168,28 @@
           <w:sz w:val="26"/>
           <w:szCs w:val="26"/>
         </w:rPr>
-        <w:t>Cần bổ sung dữ liệu thuộc lớp thiểu số và kiểm thử với tập độc lập hoặc cách chia theo nhóm dữ liệu tương tự để đánh giá khách quan hơn.s</w:t>
+        <w:t>Cần bổ sung dữ liệu thuộc lớp thiểu số và kiểm thử với tập độc lập hoặc cách chia theo nhóm dữ liệu tương tự để đánh giá k</w:t>
       </w:r>
+      <w:bookmarkStart w:id="0" w:name="_GoBack"/>
+      <w:bookmarkEnd w:id="0"/>
+      <w:r>
+        <w:rPr>
+          <w:rFonts w:ascii="Times New Roman" w:hAnsi="Times New Roman" w:cs="Times New Roman"/>
+          <w:sz w:val="26"/>
+          <w:szCs w:val="26"/>
+        </w:rPr>
+        <w:t xml:space="preserve">hách quan </w:t>
+      </w:r>
+      <w:proofErr w:type="gramStart"/>
+      <w:r>
+        <w:rPr>
+          <w:rFonts w:ascii="Times New Roman" w:hAnsi="Times New Roman" w:cs="Times New Roman"/>
+          <w:sz w:val="26"/>
+          <w:szCs w:val="26"/>
+        </w:rPr>
+        <w:t>hơn.s</w:t>
+      </w:r>
+      <w:proofErr w:type="gramEnd"/>
     </w:p>
     <w:sectPr>
       <w:pgSz w:w="12240" w:h="15840"/>
@@ -2158,7 +2202,7 @@
 </file>
 
 <file path=word/numbering.xml><?xml version="1.0" encoding="utf-8"?>
-<w:numbering xmlns:wpc="http://schemas.microsoft.com/office/word/2010/wordprocessingCanvas" xmlns:cx="http://schemas.microsoft.com/office/drawing/2014/chartex" xmlns:cx1="http://schemas.microsoft.com/office/drawing/2015/9/8/chartex" xmlns:cx2="http://schemas.microsoft.com/office/drawing/2015/10/21/chartex" xmlns:cx3="http://schemas.microsoft.com/office/drawing/2016/5/9/chartex" xmlns:cx4="http://schemas.microsoft.com/office/drawing/2016/5/10/chartex" xmlns:cx5="http://schemas.microsoft.com/office/drawing/2016/5/11/chartex" xmlns:cx6="http://schemas.microsoft.com/office/drawing/2016/5/12/chartex" xmlns:cx7="http://schemas.microsoft.com/office/drawing/2016/5/13/chartex" xmlns:cx8="http://schemas.microsoft.com/office/drawing/2016/5/14/chartex" xmlns:mc="http://schemas.openxmlformats.org/markup-compatibility/2006" xmlns:aink="http://schemas.microsoft.com/office/drawing/2016/ink" xmlns:am3d="http://schemas.microsoft.com/office/drawing/2017/model3d" xmlns:o="urn:schemas-microsoft-com:office:office" xmlns:oel="http://schemas.microsoft.com/office/2019/extlst" xmlns:r="http://schemas.openxmlformats.org/officeDocument/2006/relationships" xmlns:m="http://schemas.openxmlformats.org/officeDocument/2006/math" xmlns:v="urn:schemas-microsoft-com:vml" xmlns:wp14="http://schemas.microsoft.com/office/word/2010/wordprocessingDrawing" xmlns:wp="http://schemas.openxmlformats.org/drawingml/2006/wordprocessingDrawing" xmlns:w10="urn:schemas-microsoft-com:office:word" xmlns:w="http://schemas.openxmlformats.org/wordprocessingml/2006/main" xmlns:w14="http://schemas.microsoft.com/office/word/2010/wordml" xmlns:w15="http://schemas.microsoft.com/office/word/2012/wordml" xmlns:w16cex="http://schemas.microsoft.com/office/word/2018/wordml/cex" xmlns:w16cid="http://schemas.microsoft.com/office/word/2016/wordml/cid" xmlns:w16="http://schemas.microsoft.com/office/word/2018/wordml" xmlns:w16du="http://schemas.microsoft.com/office/word/2023/wordml/word16du" xmlns:w16sdtdh="http://schemas.microsoft.com/office/word/2020/wordml/sdtdatahash" xmlns:w16sdtfl="http://schemas.microsoft.com/office/word/2024/wordml/sdtformatlock" xmlns:w16se="http://schemas.microsoft.com/office/word/2015/wordml/symex" xmlns:wpg="http://schemas.microsoft.com/office/word/2010/wordprocessingGroup" xmlns:wpi="http://schemas.microsoft.com/office/word/2010/wordprocessingInk" xmlns:wne="http://schemas.microsoft.com/office/word/2006/wordml" xmlns:wps="http://schemas.microsoft.com/office/word/2010/wordprocessingShape" mc:Ignorable="w14 w15 w16se w16cid w16 w16cex w16sdtdh w16sdtfl w16du wp14">
+<w:numbering xmlns:wpc="http://schemas.microsoft.com/office/word/2010/wordprocessingCanvas" xmlns:cx="http://schemas.microsoft.com/office/drawing/2014/chartex" xmlns:mc="http://schemas.openxmlformats.org/markup-compatibility/2006" xmlns:o="urn:schemas-microsoft-com:office:office" xmlns:r="http://schemas.openxmlformats.org/officeDocument/2006/relationships" xmlns:m="http://schemas.openxmlformats.org/officeDocument/2006/math" xmlns:v="urn:schemas-microsoft-com:vml" xmlns:wp14="http://schemas.microsoft.com/office/word/2010/wordprocessingDrawing" xmlns:wp="http://schemas.openxmlformats.org/drawingml/2006/wordprocessingDrawing" xmlns:w10="urn:schemas-microsoft-com:office:word" xmlns:w="http://schemas.openxmlformats.org/wordprocessingml/2006/main" xmlns:w14="http://schemas.microsoft.com/office/word/2010/wordml" xmlns:w15="http://schemas.microsoft.com/office/word/2012/wordml" xmlns:w16se="http://schemas.microsoft.com/office/word/2015/wordml/symex" xmlns:wpg="http://schemas.microsoft.com/office/word/2010/wordprocessingGroup" xmlns:wpi="http://schemas.microsoft.com/office/word/2010/wordprocessingInk" xmlns:wne="http://schemas.microsoft.com/office/word/2006/wordml" xmlns:wps="http://schemas.microsoft.com/office/word/2010/wordprocessingShape" mc:Ignorable="w14 w15 w16se wp14">
   <w:abstractNum w:abstractNumId="0" w15:restartNumberingAfterBreak="0">
     <w:nsid w:val="FFFFFF89"/>
     <w:multiLevelType w:val="singleLevel"/>
@@ -2770,33 +2814,32 @@
       </w:pPr>
     </w:lvl>
   </w:abstractNum>
-  <w:num w:numId="1" w16cid:durableId="1744522586">
+  <w:num w:numId="1">
     <w:abstractNumId w:val="4"/>
   </w:num>
-  <w:num w:numId="2" w16cid:durableId="356468579">
+  <w:num w:numId="2">
     <w:abstractNumId w:val="5"/>
   </w:num>
-  <w:num w:numId="3" w16cid:durableId="1035735327">
+  <w:num w:numId="3">
     <w:abstractNumId w:val="1"/>
   </w:num>
-  <w:num w:numId="4" w16cid:durableId="85275852">
+  <w:num w:numId="4">
     <w:abstractNumId w:val="0"/>
-    <w:lvlOverride w:ilvl="0"/>
   </w:num>
-  <w:num w:numId="5" w16cid:durableId="285741971">
+  <w:num w:numId="5">
     <w:abstractNumId w:val="2"/>
   </w:num>
-  <w:num w:numId="6" w16cid:durableId="1679842231">
+  <w:num w:numId="6">
     <w:abstractNumId w:val="6"/>
   </w:num>
-  <w:num w:numId="7" w16cid:durableId="242885196">
+  <w:num w:numId="7">
     <w:abstractNumId w:val="3"/>
   </w:num>
 </w:numbering>
 </file>
 
 <file path=word/styles.xml><?xml version="1.0" encoding="utf-8"?>
-<w:styles xmlns:mc="http://schemas.openxmlformats.org/markup-compatibility/2006" xmlns:r="http://schemas.openxmlformats.org/officeDocument/2006/relationships" xmlns:w="http://schemas.openxmlformats.org/wordprocessingml/2006/main" xmlns:w14="http://schemas.microsoft.com/office/word/2010/wordml" xmlns:w15="http://schemas.microsoft.com/office/word/2012/wordml" xmlns:w16cex="http://schemas.microsoft.com/office/word/2018/wordml/cex" xmlns:w16cid="http://schemas.microsoft.com/office/word/2016/wordml/cid" xmlns:w16="http://schemas.microsoft.com/office/word/2018/wordml" xmlns:w16du="http://schemas.microsoft.com/office/word/2023/wordml/word16du" xmlns:w16sdtdh="http://schemas.microsoft.com/office/word/2020/wordml/sdtdatahash" xmlns:w16sdtfl="http://schemas.microsoft.com/office/word/2024/wordml/sdtformatlock" xmlns:w16se="http://schemas.microsoft.com/office/word/2015/wordml/symex" mc:Ignorable="w14 w15 w16se w16cid w16 w16cex w16sdtdh w16sdtfl w16du">
+<w:styles xmlns:mc="http://schemas.openxmlformats.org/markup-compatibility/2006" xmlns:r="http://schemas.openxmlformats.org/officeDocument/2006/relationships" xmlns:w="http://schemas.openxmlformats.org/wordprocessingml/2006/main" xmlns:w14="http://schemas.microsoft.com/office/word/2010/wordml" xmlns:w15="http://schemas.microsoft.com/office/word/2012/wordml" xmlns:w16se="http://schemas.microsoft.com/office/word/2015/wordml/symex" mc:Ignorable="w14 w15 w16se">
   <w:docDefaults>
     <w:rPrDefault>
       <w:rPr>
@@ -2814,7 +2857,7 @@
       </w:pPr>
     </w:pPrDefault>
   </w:docDefaults>
-  <w:latentStyles w:defLockedState="0" w:defUIPriority="99" w:defSemiHidden="0" w:defUnhideWhenUsed="0" w:defQFormat="0" w:count="376">
+  <w:latentStyles w:defLockedState="0" w:defUIPriority="99" w:defSemiHidden="0" w:defUnhideWhenUsed="0" w:defQFormat="0" w:count="371">
     <w:lsdException w:name="Normal" w:uiPriority="0" w:qFormat="1"/>
     <w:lsdException w:name="heading 1" w:uiPriority="9" w:qFormat="1"/>
     <w:lsdException w:name="heading 2" w:semiHidden="1" w:uiPriority="9" w:unhideWhenUsed="1" w:qFormat="1"/>
@@ -3186,11 +3229,6 @@
     <w:lsdException w:name="List Table 5 Dark Accent 6" w:uiPriority="50"/>
     <w:lsdException w:name="List Table 6 Colorful Accent 6" w:uiPriority="51"/>
     <w:lsdException w:name="List Table 7 Colorful Accent 6" w:uiPriority="52"/>
-    <w:lsdException w:name="Mention" w:semiHidden="1" w:unhideWhenUsed="1"/>
-    <w:lsdException w:name="Smart Hyperlink" w:semiHidden="1" w:unhideWhenUsed="1"/>
-    <w:lsdException w:name="Hashtag" w:semiHidden="1" w:unhideWhenUsed="1"/>
-    <w:lsdException w:name="Unresolved Mention" w:semiHidden="1" w:unhideWhenUsed="1"/>
-    <w:lsdException w:name="Smart Link" w:semiHidden="1" w:unhideWhenUsed="1"/>
   </w:latentStyles>
   <w:style w:type="paragraph" w:default="1" w:styleId="Normal">
     <w:name w:val="Normal"/>
@@ -3398,6 +3436,7 @@
   <w:style w:type="character" w:default="1" w:styleId="DefaultParagraphFont">
     <w:name w:val="Default Paragraph Font"/>
     <w:uiPriority w:val="1"/>
+    <w:semiHidden/>
     <w:unhideWhenUsed/>
   </w:style>
   <w:style w:type="table" w:default="1" w:styleId="TableNormal">

</xml_diff>